<commit_message>
feat: regenerate TBI SoW from proposal v6.0, update client context
- SoW now reflects AI Engineering Efficiency Program (not just AI Eng Support)
- EUR 175K fixed fee, 90-day/12-week engagement, 30/40/30 milestone payments
- 2 workstreams: Measurement & Visibility + Workflow & Vendor Accountability
- 9 deliverables + weekly reports, specific KPI targets
- Team: Henry (Principal), Russell Beggs (CTO), Mike (PM)
- TBI client memory updated with v6.0 contacts, timeline, and scope

Co-Authored-By: Claude Opus 4.6 <noreply@anthropic.com>
</commit_message>
<xml_diff>
--- a/clients/TBI/TBI Bank - AI Eng Support - SoW v1.docx
+++ b/clients/TBI/TBI Bank - AI Eng Support - SoW v1.docx
@@ -31,7 +31,7 @@
           <w:color w:val="1B3A5C"/>
           <w:sz w:val="48"/>
         </w:rPr>
-        <w:t>AI Engineering Support</w:t>
+        <w:t>AI Engineering Efficiency Program</w:t>
       </w:r>
     </w:p>
     <w:p>
@@ -115,7 +115,7 @@
         <w:rPr>
           <w:sz w:val="20"/>
         </w:rPr>
-        <w:t>Yelin.io will provide AI Engineering Support services to TBI Bank. This engagement focuses on augmenting TBI Bank's technical capabilities with AI engineering expertise, enabling the bank to accelerate its AI initiatives and build internal capacity for AI-driven operations.</w:t>
+        <w:t>Yelin.io will deliver a fixed-fee, milestone-based AI Engineering Efficiency Program for TBI Bank over 90 days (12 weeks). The engagement is structured around two core workstreams: (1) Measurement &amp; Visibility, and (2) Workflow &amp; Vendor Accountability, building the infrastructure and frameworks that enable TBI Bank to credibly pursue its 10-15% annualised developer efficiency target across approximately 200 developers.</w:t>
       </w:r>
     </w:p>
     <w:p>
@@ -123,7 +123,7 @@
         <w:rPr>
           <w:sz w:val="20"/>
         </w:rPr>
-        <w:t>This SoW formalizes the scope outlined in the TBI Bank - AI Engineering Support Proposal (v3.1) dated February 2026. Our approach combines hands-on engineering support with knowledge transfer to ensure sustainable outcomes beyond the engagement.</w:t>
+        <w:t>This SoW formalizes the scope outlined in the TBI Bank - AI Engineering Efficiency Program Proposal (v6.0) dated February 2026. Our approach combines senior practitioner expertise with a data-driven methodology -- establishing baselines, defining KPIs, and measuring impact so that TBI Bank can report progress to Advent with data, not assertions.</w:t>
       </w:r>
     </w:p>
     <w:p>
@@ -131,7 +131,7 @@
         <w:rPr>
           <w:sz w:val="20"/>
         </w:rPr>
-        <w:t>Engagement Type: Implementation</w:t>
+        <w:t>Engagement Type: Implementation (Fixed-Fee, Milestone-Based)</w:t>
       </w:r>
     </w:p>
     <w:p>
@@ -150,7 +150,7 @@
         <w:rPr>
           <w:sz w:val="20"/>
         </w:rPr>
-        <w:t>TBI Bank is a financial institution focused on commercial and retail banking services. As the banking industry increasingly adopts AI and machine learning capabilities, TBI Bank is investing in AI engineering to modernize operations, improve decision-making, and enhance customer experience. This engagement supports TBI Bank's strategic initiative to build AI competency within their technology organization.</w:t>
+        <w:t>TBI Bank is a financial institution with approximately 200 software developers across in-house and outsourced teams. Under an Advent International efficiency mandate, TBI Bank has set a 2026 goal of 10-15% annualised developer efficiency gains. GitHub Copilot has been deployed with encouraging adoption signals -- 91% of generated code uses agent mode, indicating power users are leveraging the highest-value capability. However, senior leadership cannot yet see, measure, or credibly report the impact of its AI investment. This engagement addresses that measurement and visibility gap.</w:t>
       </w:r>
     </w:p>
     <w:p>
@@ -180,7 +180,7 @@
         <w:rPr>
           <w:sz w:val="20"/>
         </w:rPr>
-        <w:t>Establish AI engineering support infrastructure for TBI Bank's technology team</w:t>
+        <w:t>Build measurement infrastructure that provides a single source of truth for AI adoption and productivity</w:t>
       </w:r>
     </w:p>
     <w:p>
@@ -191,7 +191,7 @@
         <w:rPr>
           <w:sz w:val="20"/>
         </w:rPr>
-        <w:t>Accelerate delivery of priority AI initiatives identified in the AI Masters Survey</w:t>
+        <w:t>Establish baseline measurements and a unified KPI framework to quantify efficiency gains</w:t>
       </w:r>
     </w:p>
     <w:p>
@@ -202,7 +202,7 @@
         <w:rPr>
           <w:sz w:val="20"/>
         </w:rPr>
-        <w:t>Build internal AI engineering capacity through knowledge transfer and mentoring</w:t>
+        <w:t>Equip leadership with executive dashboards and team-level scorecards for data-driven decision-making</w:t>
       </w:r>
     </w:p>
     <w:p>
@@ -213,7 +213,7 @@
         <w:rPr>
           <w:sz w:val="20"/>
         </w:rPr>
-        <w:t>Deliver production-ready AI solutions aligned with banking compliance requirements</w:t>
+        <w:t>Embed AI acceleration into the SDLC with quality gates for AI-generated code</w:t>
       </w:r>
     </w:p>
     <w:p>
@@ -224,7 +224,7 @@
         <w:rPr>
           <w:sz w:val="20"/>
         </w:rPr>
-        <w:t>Create reusable AI engineering patterns and documentation for ongoing use</w:t>
+        <w:t>Create vendor performance frameworks extending accountability to outsourced partners (~40% of developers)</w:t>
       </w:r>
     </w:p>
     <w:p>
@@ -232,7 +232,7 @@
         <w:rPr>
           <w:sz w:val="20"/>
         </w:rPr>
-        <w:t>Success Criteria:</w:t>
+        <w:t>Success Criteria (90-Day Targets):</w:t>
       </w:r>
     </w:p>
     <w:p>
@@ -243,7 +243,7 @@
         <w:rPr>
           <w:sz w:val="20"/>
         </w:rPr>
-        <w:t>AI initiatives move from concept to production within the engagement period</w:t>
+        <w:t>Daily active AI users: increase from ~50% to 75% or higher</w:t>
       </w:r>
     </w:p>
     <w:p>
@@ -254,7 +254,7 @@
         <w:rPr>
           <w:sz w:val="20"/>
         </w:rPr>
-        <w:t>TBI Bank team members demonstrate increased AI engineering proficiency</w:t>
+        <w:t>Power users (agent mode): increase from ~20% to 40% or higher</w:t>
       </w:r>
     </w:p>
     <w:p>
@@ -265,7 +265,40 @@
         <w:rPr>
           <w:sz w:val="20"/>
         </w:rPr>
-        <w:t>Documented AI engineering playbook delivered for internal use</w:t>
+        <w:t>Code acceptance rate: 10% improvement</w:t>
+      </w:r>
+    </w:p>
+    <w:p>
+      <w:pPr>
+        <w:pStyle w:val="ListBullet"/>
+      </w:pPr>
+      <w:r>
+        <w:rPr>
+          <w:sz w:val="20"/>
+        </w:rPr>
+        <w:t>PR cycle time: 5-10% reduction</w:t>
+      </w:r>
+    </w:p>
+    <w:p>
+      <w:pPr>
+        <w:pStyle w:val="ListBullet"/>
+      </w:pPr>
+      <w:r>
+        <w:rPr>
+          <w:sz w:val="20"/>
+        </w:rPr>
+        <w:t>Post-release defects: 5-10% reduction</w:t>
+      </w:r>
+    </w:p>
+    <w:p>
+      <w:pPr>
+        <w:pStyle w:val="ListBullet"/>
+      </w:pPr>
+      <w:r>
+        <w:rPr>
+          <w:sz w:val="20"/>
+        </w:rPr>
+        <w:t>Team maturity: all teams at 3 of 5 or higher on maturity scale</w:t>
       </w:r>
     </w:p>
     <w:p>
@@ -292,157 +325,681 @@
         <w:pStyle w:val="Heading2"/>
       </w:pPr>
       <w:r>
-        <w:t>Workstream 1: AI Engineering Support</w:t>
+        <w:t>Workstream 1: Measurement &amp; Visibility</w:t>
       </w:r>
     </w:p>
     <w:p>
-      <w:pPr>
-        <w:pStyle w:val="ListBullet"/>
-      </w:pPr>
       <w:r>
         <w:rPr>
           <w:sz w:val="20"/>
         </w:rPr>
-        <w:t>Hands-on AI/ML engineering for priority use cases identified by TBI Bank</w:t>
+        <w:t>Primary focus -- building the data infrastructure leadership needs.</w:t>
       </w:r>
     </w:p>
-    <w:p>
-      <w:pPr>
-        <w:pStyle w:val="ListBullet"/>
-      </w:pPr>
-      <w:r>
-        <w:rPr>
-          <w:sz w:val="20"/>
-        </w:rPr>
-        <w:t>Architecture design and review for AI systems</w:t>
-      </w:r>
-    </w:p>
-    <w:p>
-      <w:pPr>
-        <w:pStyle w:val="ListBullet"/>
-      </w:pPr>
-      <w:r>
-        <w:rPr>
-          <w:sz w:val="20"/>
-        </w:rPr>
-        <w:t>Code review and best practices guidance for AI/ML codebases</w:t>
-      </w:r>
-    </w:p>
-    <w:p>
-      <w:pPr>
-        <w:pStyle w:val="ListBullet"/>
-      </w:pPr>
-      <w:r>
-        <w:rPr>
-          <w:sz w:val="20"/>
-        </w:rPr>
-        <w:t>Integration support for AI models with existing banking systems</w:t>
-      </w:r>
-    </w:p>
-    <w:p>
-      <w:pPr>
-        <w:pStyle w:val="ListBullet"/>
-      </w:pPr>
-      <w:r>
-        <w:rPr>
-          <w:sz w:val="20"/>
-        </w:rPr>
-        <w:t>Performance optimization of AI/ML pipelines</w:t>
-      </w:r>
-    </w:p>
+    <w:tbl>
+      <w:tblPr>
+        <w:tblStyle w:val="TableGrid"/>
+        <w:tblW w:type="auto" w:w="0"/>
+        <w:jc w:val="center"/>
+        <w:tblLook w:firstColumn="1" w:firstRow="1" w:lastColumn="0" w:lastRow="0" w:noHBand="0" w:noVBand="1" w:val="04A0"/>
+      </w:tblPr>
+      <w:tblGrid>
+        <w:gridCol w:w="2160"/>
+        <w:gridCol w:w="2160"/>
+        <w:gridCol w:w="2160"/>
+        <w:gridCol w:w="2160"/>
+      </w:tblGrid>
+      <w:tr>
+        <w:tc>
+          <w:tcPr>
+            <w:tcW w:type="dxa" w:w="2160"/>
+            <w:shd w:val="clear" w:color="auto" w:fill="1B3A5C"/>
+          </w:tcPr>
+          <w:p>
+            <w:r>
+              <w:rPr>
+                <w:b/>
+                <w:color w:val="FFFFFF"/>
+                <w:sz w:val="20"/>
+              </w:rPr>
+              <w:t>#</w:t>
+            </w:r>
+          </w:p>
+        </w:tc>
+        <w:tc>
+          <w:tcPr>
+            <w:tcW w:type="dxa" w:w="2160"/>
+            <w:shd w:val="clear" w:color="auto" w:fill="1B3A5C"/>
+          </w:tcPr>
+          <w:p>
+            <w:r>
+              <w:rPr>
+                <w:b/>
+                <w:color w:val="FFFFFF"/>
+                <w:sz w:val="20"/>
+              </w:rPr>
+              <w:t>Deliverable</w:t>
+            </w:r>
+          </w:p>
+        </w:tc>
+        <w:tc>
+          <w:tcPr>
+            <w:tcW w:type="dxa" w:w="2160"/>
+            <w:shd w:val="clear" w:color="auto" w:fill="1B3A5C"/>
+          </w:tcPr>
+          <w:p>
+            <w:r>
+              <w:rPr>
+                <w:b/>
+                <w:color w:val="FFFFFF"/>
+                <w:sz w:val="20"/>
+              </w:rPr>
+              <w:t>Description</w:t>
+            </w:r>
+          </w:p>
+        </w:tc>
+        <w:tc>
+          <w:tcPr>
+            <w:tcW w:type="dxa" w:w="2160"/>
+            <w:shd w:val="clear" w:color="auto" w:fill="1B3A5C"/>
+          </w:tcPr>
+          <w:p>
+            <w:r>
+              <w:rPr>
+                <w:b/>
+                <w:color w:val="FFFFFF"/>
+                <w:sz w:val="20"/>
+              </w:rPr>
+              <w:t>Timing</w:t>
+            </w:r>
+          </w:p>
+        </w:tc>
+      </w:tr>
+      <w:tr>
+        <w:tc>
+          <w:tcPr>
+            <w:tcW w:type="dxa" w:w="2160"/>
+          </w:tcPr>
+          <w:p>
+            <w:r>
+              <w:rPr>
+                <w:sz w:val="20"/>
+              </w:rPr>
+              <w:t>1.1</w:t>
+            </w:r>
+          </w:p>
+        </w:tc>
+        <w:tc>
+          <w:tcPr>
+            <w:tcW w:type="dxa" w:w="2160"/>
+          </w:tcPr>
+          <w:p>
+            <w:r>
+              <w:rPr>
+                <w:sz w:val="20"/>
+              </w:rPr>
+              <w:t>Data Landscape Audit</w:t>
+            </w:r>
+          </w:p>
+        </w:tc>
+        <w:tc>
+          <w:tcPr>
+            <w:tcW w:type="dxa" w:w="2160"/>
+          </w:tcPr>
+          <w:p>
+            <w:r>
+              <w:rPr>
+                <w:sz w:val="20"/>
+              </w:rPr>
+              <w:t>Inventory, quality assessment, and gap analysis of existing data sources (Jira, Copilot telemetry, PR data)</w:t>
+            </w:r>
+          </w:p>
+        </w:tc>
+        <w:tc>
+          <w:tcPr>
+            <w:tcW w:type="dxa" w:w="2160"/>
+          </w:tcPr>
+          <w:p>
+            <w:r>
+              <w:rPr>
+                <w:sz w:val="20"/>
+              </w:rPr>
+              <w:t>Weeks 1-3</w:t>
+            </w:r>
+          </w:p>
+        </w:tc>
+      </w:tr>
+      <w:tr>
+        <w:tc>
+          <w:tcPr>
+            <w:tcW w:type="dxa" w:w="2160"/>
+          </w:tcPr>
+          <w:p>
+            <w:r>
+              <w:rPr>
+                <w:sz w:val="20"/>
+              </w:rPr>
+              <w:t>1.2</w:t>
+            </w:r>
+          </w:p>
+        </w:tc>
+        <w:tc>
+          <w:tcPr>
+            <w:tcW w:type="dxa" w:w="2160"/>
+          </w:tcPr>
+          <w:p>
+            <w:r>
+              <w:rPr>
+                <w:sz w:val="20"/>
+              </w:rPr>
+              <w:t>Unified KPI Framework</w:t>
+            </w:r>
+          </w:p>
+        </w:tc>
+        <w:tc>
+          <w:tcPr>
+            <w:tcW w:type="dxa" w:w="2160"/>
+          </w:tcPr>
+          <w:p>
+            <w:r>
+              <w:rPr>
+                <w:sz w:val="20"/>
+              </w:rPr>
+              <w:t>Adoption, velocity, quality, and predictability indicators aligned with the 10-15% efficiency target</w:t>
+            </w:r>
+          </w:p>
+        </w:tc>
+        <w:tc>
+          <w:tcPr>
+            <w:tcW w:type="dxa" w:w="2160"/>
+          </w:tcPr>
+          <w:p>
+            <w:r>
+              <w:rPr>
+                <w:sz w:val="20"/>
+              </w:rPr>
+              <w:t>Weeks 2-4</w:t>
+            </w:r>
+          </w:p>
+        </w:tc>
+      </w:tr>
+      <w:tr>
+        <w:tc>
+          <w:tcPr>
+            <w:tcW w:type="dxa" w:w="2160"/>
+          </w:tcPr>
+          <w:p>
+            <w:r>
+              <w:rPr>
+                <w:sz w:val="20"/>
+              </w:rPr>
+              <w:t>1.3</w:t>
+            </w:r>
+          </w:p>
+        </w:tc>
+        <w:tc>
+          <w:tcPr>
+            <w:tcW w:type="dxa" w:w="2160"/>
+          </w:tcPr>
+          <w:p>
+            <w:r>
+              <w:rPr>
+                <w:sz w:val="20"/>
+              </w:rPr>
+              <w:t>Baseline Measurement Report</w:t>
+            </w:r>
+          </w:p>
+        </w:tc>
+        <w:tc>
+          <w:tcPr>
+            <w:tcW w:type="dxa" w:w="2160"/>
+          </w:tcPr>
+          <w:p>
+            <w:r>
+              <w:rPr>
+                <w:sz w:val="20"/>
+              </w:rPr>
+              <w:t>Pre-intervention snapshot against defined KPIs, establishing the starting point for improvement measurement</w:t>
+            </w:r>
+          </w:p>
+        </w:tc>
+        <w:tc>
+          <w:tcPr>
+            <w:tcW w:type="dxa" w:w="2160"/>
+          </w:tcPr>
+          <w:p>
+            <w:r>
+              <w:rPr>
+                <w:sz w:val="20"/>
+              </w:rPr>
+              <w:t>Weeks 3-4</w:t>
+            </w:r>
+          </w:p>
+        </w:tc>
+      </w:tr>
+      <w:tr>
+        <w:tc>
+          <w:tcPr>
+            <w:tcW w:type="dxa" w:w="2160"/>
+          </w:tcPr>
+          <w:p>
+            <w:r>
+              <w:rPr>
+                <w:sz w:val="20"/>
+              </w:rPr>
+              <w:t>1.4</w:t>
+            </w:r>
+          </w:p>
+        </w:tc>
+        <w:tc>
+          <w:tcPr>
+            <w:tcW w:type="dxa" w:w="2160"/>
+          </w:tcPr>
+          <w:p>
+            <w:r>
+              <w:rPr>
+                <w:sz w:val="20"/>
+              </w:rPr>
+              <w:t>Executive Dashboard Specification</w:t>
+            </w:r>
+          </w:p>
+        </w:tc>
+        <w:tc>
+          <w:tcPr>
+            <w:tcW w:type="dxa" w:w="2160"/>
+          </w:tcPr>
+          <w:p>
+            <w:r>
+              <w:rPr>
+                <w:sz w:val="20"/>
+              </w:rPr>
+              <w:t>Design and data requirements for TBI Bank to build internally (specification only -- implementation is TBI Bank responsibility)</w:t>
+            </w:r>
+          </w:p>
+        </w:tc>
+        <w:tc>
+          <w:tcPr>
+            <w:tcW w:type="dxa" w:w="2160"/>
+          </w:tcPr>
+          <w:p>
+            <w:r>
+              <w:rPr>
+                <w:sz w:val="20"/>
+              </w:rPr>
+              <w:t>Weeks 4-8</w:t>
+            </w:r>
+          </w:p>
+        </w:tc>
+      </w:tr>
+      <w:tr>
+        <w:tc>
+          <w:tcPr>
+            <w:tcW w:type="dxa" w:w="2160"/>
+          </w:tcPr>
+          <w:p>
+            <w:r>
+              <w:rPr>
+                <w:sz w:val="20"/>
+              </w:rPr>
+              <w:t>1.5</w:t>
+            </w:r>
+          </w:p>
+        </w:tc>
+        <w:tc>
+          <w:tcPr>
+            <w:tcW w:type="dxa" w:w="2160"/>
+          </w:tcPr>
+          <w:p>
+            <w:r>
+              <w:rPr>
+                <w:sz w:val="20"/>
+              </w:rPr>
+              <w:t>Team-Level Scorecards</w:t>
+            </w:r>
+          </w:p>
+        </w:tc>
+        <w:tc>
+          <w:tcPr>
+            <w:tcW w:type="dxa" w:w="2160"/>
+          </w:tcPr>
+          <w:p>
+            <w:r>
+              <w:rPr>
+                <w:sz w:val="20"/>
+              </w:rPr>
+              <w:t>Per-team adoption and maturity views enabling targeted action</w:t>
+            </w:r>
+          </w:p>
+        </w:tc>
+        <w:tc>
+          <w:tcPr>
+            <w:tcW w:type="dxa" w:w="2160"/>
+          </w:tcPr>
+          <w:p>
+            <w:r>
+              <w:rPr>
+                <w:sz w:val="20"/>
+              </w:rPr>
+              <w:t>Weeks 6-8</w:t>
+            </w:r>
+          </w:p>
+        </w:tc>
+      </w:tr>
+      <w:tr>
+        <w:tc>
+          <w:tcPr>
+            <w:tcW w:type="dxa" w:w="2160"/>
+          </w:tcPr>
+          <w:p>
+            <w:r>
+              <w:rPr>
+                <w:sz w:val="20"/>
+              </w:rPr>
+              <w:t>1.6</w:t>
+            </w:r>
+          </w:p>
+        </w:tc>
+        <w:tc>
+          <w:tcPr>
+            <w:tcW w:type="dxa" w:w="2160"/>
+          </w:tcPr>
+          <w:p>
+            <w:r>
+              <w:rPr>
+                <w:sz w:val="20"/>
+              </w:rPr>
+              <w:t>Change Management Plan &amp; 90-Day Impact Assessment</w:t>
+            </w:r>
+          </w:p>
+        </w:tc>
+        <w:tc>
+          <w:tcPr>
+            <w:tcW w:type="dxa" w:w="2160"/>
+          </w:tcPr>
+          <w:p>
+            <w:r>
+              <w:rPr>
+                <w:sz w:val="20"/>
+              </w:rPr>
+              <w:t>Outcomes vs baseline, course corrections, and next-phase recommendations</w:t>
+            </w:r>
+          </w:p>
+        </w:tc>
+        <w:tc>
+          <w:tcPr>
+            <w:tcW w:type="dxa" w:w="2160"/>
+          </w:tcPr>
+          <w:p>
+            <w:r>
+              <w:rPr>
+                <w:sz w:val="20"/>
+              </w:rPr>
+              <w:t>Weeks 11-12</w:t>
+            </w:r>
+          </w:p>
+        </w:tc>
+      </w:tr>
+    </w:tbl>
+    <w:p/>
     <w:p>
       <w:pPr>
         <w:pStyle w:val="Heading2"/>
       </w:pPr>
       <w:r>
-        <w:t>Workstream 2: Knowledge Transfer &amp; Capacity Building</w:t>
+        <w:t>Workstream 2: Workflow &amp; Vendor Accountability</w:t>
       </w:r>
     </w:p>
     <w:p>
-      <w:pPr>
-        <w:pStyle w:val="ListBullet"/>
-      </w:pPr>
       <w:r>
         <w:rPr>
           <w:sz w:val="20"/>
         </w:rPr>
-        <w:t>Pair programming and mentoring sessions with TBI Bank engineers</w:t>
+        <w:t>Supporting workstream -- embedding AI into delivery workflows.</w:t>
       </w:r>
     </w:p>
-    <w:p>
-      <w:pPr>
-        <w:pStyle w:val="ListBullet"/>
-      </w:pPr>
-      <w:r>
-        <w:rPr>
-          <w:sz w:val="20"/>
-        </w:rPr>
-        <w:t>AI engineering playbook creation (documentation, patterns, templates)</w:t>
-      </w:r>
-    </w:p>
-    <w:p>
-      <w:pPr>
-        <w:pStyle w:val="ListBullet"/>
-      </w:pPr>
-      <w:r>
-        <w:rPr>
-          <w:sz w:val="20"/>
-        </w:rPr>
-        <w:t>Technology selection guidance for AI/ML tooling and infrastructure</w:t>
-      </w:r>
-    </w:p>
-    <w:p>
-      <w:pPr>
-        <w:pStyle w:val="ListBullet"/>
-      </w:pPr>
-      <w:r>
-        <w:rPr>
-          <w:sz w:val="20"/>
-        </w:rPr>
-        <w:t>Best practices workshops on responsible AI in banking</w:t>
-      </w:r>
-    </w:p>
-    <w:p>
-      <w:pPr>
-        <w:pStyle w:val="Heading2"/>
-      </w:pPr>
-      <w:r>
-        <w:t>Workstream 3: Strategic Advisory</w:t>
-      </w:r>
-    </w:p>
-    <w:p>
-      <w:pPr>
-        <w:pStyle w:val="ListBullet"/>
-      </w:pPr>
-      <w:r>
-        <w:rPr>
-          <w:sz w:val="20"/>
-        </w:rPr>
-        <w:t>AI initiative prioritization based on business impact and feasibility</w:t>
-      </w:r>
-    </w:p>
-    <w:p>
-      <w:pPr>
-        <w:pStyle w:val="ListBullet"/>
-      </w:pPr>
-      <w:r>
-        <w:rPr>
-          <w:sz w:val="20"/>
-        </w:rPr>
-        <w:t>Technical due diligence on AI vendor solutions under consideration</w:t>
-      </w:r>
-    </w:p>
-    <w:p>
-      <w:pPr>
-        <w:pStyle w:val="ListBullet"/>
-      </w:pPr>
-      <w:r>
-        <w:rPr>
-          <w:sz w:val="20"/>
-        </w:rPr>
-        <w:t>AI roadmap refinement aligned with TBI Bank's technology strategy</w:t>
-      </w:r>
-    </w:p>
+    <w:tbl>
+      <w:tblPr>
+        <w:tblStyle w:val="TableGrid"/>
+        <w:tblW w:type="auto" w:w="0"/>
+        <w:jc w:val="center"/>
+        <w:tblLook w:firstColumn="1" w:firstRow="1" w:lastColumn="0" w:lastRow="0" w:noHBand="0" w:noVBand="1" w:val="04A0"/>
+      </w:tblPr>
+      <w:tblGrid>
+        <w:gridCol w:w="2160"/>
+        <w:gridCol w:w="2160"/>
+        <w:gridCol w:w="2160"/>
+        <w:gridCol w:w="2160"/>
+      </w:tblGrid>
+      <w:tr>
+        <w:tc>
+          <w:tcPr>
+            <w:tcW w:type="dxa" w:w="2160"/>
+            <w:shd w:val="clear" w:color="auto" w:fill="1B3A5C"/>
+          </w:tcPr>
+          <w:p>
+            <w:r>
+              <w:rPr>
+                <w:b/>
+                <w:color w:val="FFFFFF"/>
+                <w:sz w:val="20"/>
+              </w:rPr>
+              <w:t>#</w:t>
+            </w:r>
+          </w:p>
+        </w:tc>
+        <w:tc>
+          <w:tcPr>
+            <w:tcW w:type="dxa" w:w="2160"/>
+            <w:shd w:val="clear" w:color="auto" w:fill="1B3A5C"/>
+          </w:tcPr>
+          <w:p>
+            <w:r>
+              <w:rPr>
+                <w:b/>
+                <w:color w:val="FFFFFF"/>
+                <w:sz w:val="20"/>
+              </w:rPr>
+              <w:t>Deliverable</w:t>
+            </w:r>
+          </w:p>
+        </w:tc>
+        <w:tc>
+          <w:tcPr>
+            <w:tcW w:type="dxa" w:w="2160"/>
+            <w:shd w:val="clear" w:color="auto" w:fill="1B3A5C"/>
+          </w:tcPr>
+          <w:p>
+            <w:r>
+              <w:rPr>
+                <w:b/>
+                <w:color w:val="FFFFFF"/>
+                <w:sz w:val="20"/>
+              </w:rPr>
+              <w:t>Description</w:t>
+            </w:r>
+          </w:p>
+        </w:tc>
+        <w:tc>
+          <w:tcPr>
+            <w:tcW w:type="dxa" w:w="2160"/>
+            <w:shd w:val="clear" w:color="auto" w:fill="1B3A5C"/>
+          </w:tcPr>
+          <w:p>
+            <w:r>
+              <w:rPr>
+                <w:b/>
+                <w:color w:val="FFFFFF"/>
+                <w:sz w:val="20"/>
+              </w:rPr>
+              <w:t>Timing</w:t>
+            </w:r>
+          </w:p>
+        </w:tc>
+      </w:tr>
+      <w:tr>
+        <w:tc>
+          <w:tcPr>
+            <w:tcW w:type="dxa" w:w="2160"/>
+          </w:tcPr>
+          <w:p>
+            <w:r>
+              <w:rPr>
+                <w:sz w:val="20"/>
+              </w:rPr>
+              <w:t>2.1</w:t>
+            </w:r>
+          </w:p>
+        </w:tc>
+        <w:tc>
+          <w:tcPr>
+            <w:tcW w:type="dxa" w:w="2160"/>
+          </w:tcPr>
+          <w:p>
+            <w:r>
+              <w:rPr>
+                <w:sz w:val="20"/>
+              </w:rPr>
+              <w:t>AI Acceleration Overlay</w:t>
+            </w:r>
+          </w:p>
+        </w:tc>
+        <w:tc>
+          <w:tcPr>
+            <w:tcW w:type="dxa" w:w="2160"/>
+          </w:tcPr>
+          <w:p>
+            <w:r>
+              <w:rPr>
+                <w:sz w:val="20"/>
+              </w:rPr>
+              <w:t>Mapping where AI tooling integrates into the existing SDLC to speed up delivery; identify single opportunity to implement change</w:t>
+            </w:r>
+          </w:p>
+        </w:tc>
+        <w:tc>
+          <w:tcPr>
+            <w:tcW w:type="dxa" w:w="2160"/>
+          </w:tcPr>
+          <w:p>
+            <w:r>
+              <w:rPr>
+                <w:sz w:val="20"/>
+              </w:rPr>
+              <w:t>Weeks 3-6</w:t>
+            </w:r>
+          </w:p>
+        </w:tc>
+      </w:tr>
+      <w:tr>
+        <w:tc>
+          <w:tcPr>
+            <w:tcW w:type="dxa" w:w="2160"/>
+          </w:tcPr>
+          <w:p>
+            <w:r>
+              <w:rPr>
+                <w:sz w:val="20"/>
+              </w:rPr>
+              <w:t>2.2</w:t>
+            </w:r>
+          </w:p>
+        </w:tc>
+        <w:tc>
+          <w:tcPr>
+            <w:tcW w:type="dxa" w:w="2160"/>
+          </w:tcPr>
+          <w:p>
+            <w:r>
+              <w:rPr>
+                <w:sz w:val="20"/>
+              </w:rPr>
+              <w:t>AI Quality Gates Specification</w:t>
+            </w:r>
+          </w:p>
+        </w:tc>
+        <w:tc>
+          <w:tcPr>
+            <w:tcW w:type="dxa" w:w="2160"/>
+          </w:tcPr>
+          <w:p>
+            <w:r>
+              <w:rPr>
+                <w:sz w:val="20"/>
+              </w:rPr>
+              <w:t>Standards for reviewing and accepting AI-generated code, including SQL-specific guidance for legacy systems</w:t>
+            </w:r>
+          </w:p>
+        </w:tc>
+        <w:tc>
+          <w:tcPr>
+            <w:tcW w:type="dxa" w:w="2160"/>
+          </w:tcPr>
+          <w:p>
+            <w:r>
+              <w:rPr>
+                <w:sz w:val="20"/>
+              </w:rPr>
+              <w:t>Weeks 4-7</w:t>
+            </w:r>
+          </w:p>
+        </w:tc>
+      </w:tr>
+      <w:tr>
+        <w:tc>
+          <w:tcPr>
+            <w:tcW w:type="dxa" w:w="2160"/>
+          </w:tcPr>
+          <w:p>
+            <w:r>
+              <w:rPr>
+                <w:sz w:val="20"/>
+              </w:rPr>
+              <w:t>2.3</w:t>
+            </w:r>
+          </w:p>
+        </w:tc>
+        <w:tc>
+          <w:tcPr>
+            <w:tcW w:type="dxa" w:w="2160"/>
+          </w:tcPr>
+          <w:p>
+            <w:r>
+              <w:rPr>
+                <w:sz w:val="20"/>
+              </w:rPr>
+              <w:t>Vendor Performance Framework</w:t>
+            </w:r>
+          </w:p>
+        </w:tc>
+        <w:tc>
+          <w:tcPr>
+            <w:tcW w:type="dxa" w:w="2160"/>
+          </w:tcPr>
+          <w:p>
+            <w:r>
+              <w:rPr>
+                <w:sz w:val="20"/>
+              </w:rPr>
+              <w:t>KPIs, efficiency standards, and reporting expectations for outsourced development partners</w:t>
+            </w:r>
+          </w:p>
+        </w:tc>
+        <w:tc>
+          <w:tcPr>
+            <w:tcW w:type="dxa" w:w="2160"/>
+          </w:tcPr>
+          <w:p>
+            <w:r>
+              <w:rPr>
+                <w:sz w:val="20"/>
+              </w:rPr>
+              <w:t>Weeks 6-10</w:t>
+            </w:r>
+          </w:p>
+        </w:tc>
+      </w:tr>
+    </w:tbl>
+    <w:p/>
     <w:p>
       <w:pPr>
         <w:pStyle w:val="Heading2"/>
@@ -459,7 +1016,7 @@
         <w:rPr>
           <w:sz w:val="20"/>
         </w:rPr>
-        <w:t>Production infrastructure management or DevOps responsibilities</w:t>
+        <w:t>Enterprise AI strategy and ML model development (focus is AI engineering tooling for software development only)</w:t>
       </w:r>
     </w:p>
     <w:p>
@@ -470,7 +1027,29 @@
         <w:rPr>
           <w:sz w:val="20"/>
         </w:rPr>
-        <w:t>Regulatory compliance advisory (legal or audit functions)</w:t>
+        <w:t>Implementation of dashboards, scorecards, or quality gates (all deliverables are specifications, frameworks, and recommendations)</w:t>
+      </w:r>
+    </w:p>
+    <w:p>
+      <w:pPr>
+        <w:pStyle w:val="ListBullet"/>
+      </w:pPr>
+      <w:r>
+        <w:rPr>
+          <w:sz w:val="20"/>
+        </w:rPr>
+        <w:t>Tool selection and licensing decisions (Yelin.io provides recommendations only)</w:t>
+      </w:r>
+    </w:p>
+    <w:p>
+      <w:pPr>
+        <w:pStyle w:val="ListBullet"/>
+      </w:pPr>
+      <w:r>
+        <w:rPr>
+          <w:sz w:val="20"/>
+        </w:rPr>
+        <w:t>Strategic options catalogue (Claude Code pilot, on-site sprints, coaching, continuous improvement, executive coaching) -- available as separate engagement</w:t>
       </w:r>
     </w:p>
     <w:p>
@@ -492,18 +1071,7 @@
         <w:rPr>
           <w:sz w:val="20"/>
         </w:rPr>
-        <w:t>Data migration or ETL development</w:t>
-      </w:r>
-    </w:p>
-    <w:p>
-      <w:pPr>
-        <w:pStyle w:val="ListBullet"/>
-      </w:pPr>
-      <w:r>
-        <w:rPr>
-          <w:sz w:val="20"/>
-        </w:rPr>
-        <w:t>Ongoing production support after engagement close</w:t>
+        <w:t>Production infrastructure management or DevOps responsibilities</w:t>
       </w:r>
     </w:p>
     <w:p>
@@ -518,14 +1086,11 @@
       </w:r>
     </w:p>
     <w:p>
-      <w:pPr>
-        <w:pStyle w:val="ListBullet"/>
-      </w:pPr>
       <w:r>
         <w:rPr>
           <w:sz w:val="20"/>
         </w:rPr>
-        <w:t>TBI Bank will designate a primary point of contact for the duration of the engagement.</w:t>
+        <w:t>Client-Side Assumptions:</w:t>
       </w:r>
     </w:p>
     <w:p>
@@ -536,7 +1101,7 @@
         <w:rPr>
           <w:sz w:val="20"/>
         </w:rPr>
-        <w:t>TBI Bank will provide timely access to relevant systems, data, environments, and personnel as needed.</w:t>
+        <w:t>TBI Bank will provide timely access to Jira data, GitHub Copilot telemetry, and PR data within the first two weeks</w:t>
       </w:r>
     </w:p>
     <w:p>
@@ -547,7 +1112,7 @@
         <w:rPr>
           <w:sz w:val="20"/>
         </w:rPr>
-        <w:t>Work will be performed remotely unless otherwise agreed in writing.</w:t>
+        <w:t>The internal working group (Nikola Kalfov, Oleksandr Kyslashko, Pavlina Bazhlekova, Sinan Turkmen) will be available for weekly 1-hour sessions</w:t>
       </w:r>
     </w:p>
     <w:p>
@@ -558,7 +1123,7 @@
         <w:rPr>
           <w:sz w:val="20"/>
         </w:rPr>
-        <w:t>TBI Bank will provide access to subject matter experts for requirements gathering and design review.</w:t>
+        <w:t>SVP Technology (Gurkan Papila) will be available for fortnightly 30-minute executive checkpoints</w:t>
       </w:r>
     </w:p>
     <w:p>
@@ -569,7 +1134,7 @@
         <w:rPr>
           <w:sz w:val="20"/>
         </w:rPr>
-        <w:t>TBI Bank is responsible for all internal approvals, change management, and end-user communications.</w:t>
+        <w:t>TBI Bank will facilitate vendor communications where engagement with outsourced partners is required</w:t>
       </w:r>
     </w:p>
     <w:p>
@@ -580,7 +1145,15 @@
         <w:rPr>
           <w:sz w:val="20"/>
         </w:rPr>
-        <w:t>Any material changes to scope, timeline, or budget will follow the Change Request Process outlined in Appendix A.</w:t>
+        <w:t>TBI Bank will designate a primary technical point of contact for day-to-day coordination</w:t>
+      </w:r>
+    </w:p>
+    <w:p>
+      <w:r>
+        <w:rPr>
+          <w:sz w:val="20"/>
+        </w:rPr>
+        <w:t>Scope Boundaries:</w:t>
       </w:r>
     </w:p>
     <w:p>
@@ -591,7 +1164,7 @@
         <w:rPr>
           <w:sz w:val="20"/>
         </w:rPr>
-        <w:t>Yelin.io will provide all work documentation in English.</w:t>
+        <w:t>All deliverables are advisory: specifications, frameworks, and recommendations -- implementation is TBI Bank's responsibility</w:t>
       </w:r>
     </w:p>
     <w:p>
@@ -602,7 +1175,7 @@
         <w:rPr>
           <w:sz w:val="20"/>
         </w:rPr>
-        <w:t>Yelin.io resources will work contiguously from start to finish.</w:t>
+        <w:t>Tool selection and licensing remains TBI Bank's responsibility; Yelin.io provides recommendations only</w:t>
       </w:r>
     </w:p>
     <w:p>
@@ -613,7 +1186,7 @@
         <w:rPr>
           <w:sz w:val="20"/>
         </w:rPr>
-        <w:t>TBI Bank will provide access to relevant AI/ML development environments and tools.</w:t>
+        <w:t>Delivery is remote with on-site visits available as a strategic option (separate engagement)</w:t>
       </w:r>
     </w:p>
     <w:p>
@@ -624,7 +1197,15 @@
         <w:rPr>
           <w:sz w:val="20"/>
         </w:rPr>
-        <w:t>TBI Bank engineering team members will be available for pair programming and knowledge transfer sessions as scheduled.</w:t>
+        <w:t>Any material changes to scope, timeline, or budget will follow the Change Request Process (Appendix A)</w:t>
+      </w:r>
+    </w:p>
+    <w:p>
+      <w:r>
+        <w:rPr>
+          <w:sz w:val="20"/>
+        </w:rPr>
+        <w:t>Key Dependencies:</w:t>
       </w:r>
     </w:p>
     <w:p>
@@ -635,7 +1216,7 @@
         <w:rPr>
           <w:sz w:val="20"/>
         </w:rPr>
-        <w:t>AI initiatives to be supported will be jointly prioritized during the Discovery phase.</w:t>
+        <w:t>Jira data quality: if story point estimation or ticket hygiene is inconsistent, baseline accuracy may be limited -- Yelin.io will flag issues early</w:t>
       </w:r>
     </w:p>
     <w:p>
@@ -646,7 +1227,45 @@
         <w:rPr>
           <w:sz w:val="20"/>
         </w:rPr>
-        <w:t>Upon completion, a Project Closeout meeting will be held. Failure to provide feedback within 10 business days of closeout will constitute acceptance.</w:t>
+        <w:t>Vendor cooperation: framework requires vendor willingness to share data -- executive communication from TBI Bank recommended</w:t>
+      </w:r>
+    </w:p>
+    <w:p>
+      <w:pPr>
+        <w:pStyle w:val="ListBullet"/>
+      </w:pPr>
+      <w:r>
+        <w:rPr>
+          <w:sz w:val="20"/>
+        </w:rPr>
+        <w:t>Concurrent initiatives: major disruptions during the engagement window could impact working group availability and data reliability</w:t>
+      </w:r>
+    </w:p>
+    <w:p>
+      <w:pPr>
+        <w:pStyle w:val="ListBullet"/>
+      </w:pPr>
+      <w:r>
+        <w:rPr>
+          <w:sz w:val="20"/>
+        </w:rPr>
+        <w:t>Yelin.io will identify and flag any data quality or access issues in the first two weeks to minimise programme risk</w:t>
+      </w:r>
+    </w:p>
+    <w:p>
+      <w:pPr>
+        <w:pStyle w:val="ListBullet"/>
+      </w:pPr>
+      <w:r>
+        <w:rPr>
+          <w:sz w:val="20"/>
+        </w:rPr>
+        <w:t>Yelin.io resources will work contiguously from start to finish</w:t>
+      </w:r>
+    </w:p>
+    <w:p>
+      <w:r>
+        <w:br w:type="page"/>
       </w:r>
     </w:p>
     <w:p>
@@ -665,7 +1284,7 @@
         <w:rPr>
           <w:sz w:val="20"/>
         </w:rPr>
-        <w:t>Yelin.io will provide the following deliverables. All deliverables will be reviewed and approved by the client, with opportunity for revision.</w:t>
+        <w:t>Yelin.io will provide the following deliverables. All deliverables will be reviewed and approved by TBI Bank, with opportunity for revision.</w:t>
       </w:r>
     </w:p>
     <w:tbl>
@@ -757,7 +1376,7 @@
               <w:rPr>
                 <w:sz w:val="20"/>
               </w:rPr>
-              <w:t>Kick-off Presentation</w:t>
+              <w:t>Data Landscape Audit</w:t>
             </w:r>
           </w:p>
         </w:tc>
@@ -770,7 +1389,7 @@
               <w:rPr>
                 <w:sz w:val="20"/>
               </w:rPr>
-              <w:t>Project overview, scope confirmation, team introductions, timeline review, and communication plan</w:t>
+              <w:t>Inventory, quality assessment, and gap analysis of existing data sources</w:t>
             </w:r>
           </w:p>
         </w:tc>
@@ -783,7 +1402,7 @@
               <w:rPr>
                 <w:sz w:val="20"/>
               </w:rPr>
-              <w:t>PPTX</w:t>
+              <w:t>Report (DOCX/PDF)</w:t>
             </w:r>
           </w:p>
         </w:tc>
@@ -796,7 +1415,7 @@
               <w:rPr>
                 <w:sz w:val="20"/>
               </w:rPr>
-              <w:t>Week 1</w:t>
+              <w:t>Week 3</w:t>
             </w:r>
           </w:p>
         </w:tc>
@@ -811,7 +1430,7 @@
               <w:rPr>
                 <w:sz w:val="20"/>
               </w:rPr>
-              <w:t>AI Initiative Prioritization</w:t>
+              <w:t>Unified KPI Framework</w:t>
             </w:r>
           </w:p>
         </w:tc>
@@ -824,7 +1443,7 @@
               <w:rPr>
                 <w:sz w:val="20"/>
               </w:rPr>
-              <w:t>Ranked list of AI initiatives with feasibility scores, business impact assessment, and recommended sequencing</w:t>
+              <w:t>Adoption, velocity, quality, and predictability indicators</w:t>
             </w:r>
           </w:p>
         </w:tc>
@@ -837,7 +1456,7 @@
               <w:rPr>
                 <w:sz w:val="20"/>
               </w:rPr>
-              <w:t>PPTX + XLSX</w:t>
+              <w:t>Framework Doc + XLSX</w:t>
             </w:r>
           </w:p>
         </w:tc>
@@ -850,7 +1469,7 @@
               <w:rPr>
                 <w:sz w:val="20"/>
               </w:rPr>
-              <w:t>Week 2</w:t>
+              <w:t>Week 4</w:t>
             </w:r>
           </w:p>
         </w:tc>
@@ -865,7 +1484,7 @@
               <w:rPr>
                 <w:sz w:val="20"/>
               </w:rPr>
-              <w:t>Architecture &amp; Design Documents</w:t>
+              <w:t>Baseline Measurement Report</w:t>
             </w:r>
           </w:p>
         </w:tc>
@@ -878,7 +1497,7 @@
               <w:rPr>
                 <w:sz w:val="20"/>
               </w:rPr>
-              <w:t>Technical architecture for prioritized AI solutions, including integration points, data flows, and technology stack</w:t>
+              <w:t>Pre-intervention snapshot against defined KPIs</w:t>
             </w:r>
           </w:p>
         </w:tc>
@@ -891,7 +1510,7 @@
               <w:rPr>
                 <w:sz w:val="20"/>
               </w:rPr>
-              <w:t>DOCX</w:t>
+              <w:t>Report (DOCX/PDF)</w:t>
             </w:r>
           </w:p>
         </w:tc>
@@ -904,7 +1523,7 @@
               <w:rPr>
                 <w:sz w:val="20"/>
               </w:rPr>
-              <w:t>Week 3-4</w:t>
+              <w:t>Week 4</w:t>
             </w:r>
           </w:p>
         </w:tc>
@@ -919,7 +1538,7 @@
               <w:rPr>
                 <w:sz w:val="20"/>
               </w:rPr>
-              <w:t>AI Engineering Playbook</w:t>
+              <w:t>Week 6 Interim Report</w:t>
             </w:r>
           </w:p>
         </w:tc>
@@ -932,7 +1551,7 @@
               <w:rPr>
                 <w:sz w:val="20"/>
               </w:rPr>
-              <w:t>Reusable patterns, templates, and best practices documentation for TBI Bank's ongoing AI development</w:t>
+              <w:t>Early adoption patterns, initial baseline data, and course corrections</w:t>
             </w:r>
           </w:p>
         </w:tc>
@@ -945,7 +1564,7 @@
               <w:rPr>
                 <w:sz w:val="20"/>
               </w:rPr>
-              <w:t>DOCX + Code Repo</w:t>
+              <w:t>Presentation (PPTX)</w:t>
             </w:r>
           </w:p>
         </w:tc>
@@ -958,7 +1577,7 @@
               <w:rPr>
                 <w:sz w:val="20"/>
               </w:rPr>
-              <w:t>Week 6-8</w:t>
+              <w:t>Week 6</w:t>
             </w:r>
           </w:p>
         </w:tc>
@@ -973,7 +1592,7 @@
               <w:rPr>
                 <w:sz w:val="20"/>
               </w:rPr>
-              <w:t>Progress Reports</w:t>
+              <w:t>Executive Dashboard Specification</w:t>
             </w:r>
           </w:p>
         </w:tc>
@@ -986,7 +1605,331 @@
               <w:rPr>
                 <w:sz w:val="20"/>
               </w:rPr>
-              <w:t>Weekly status updates covering completed work, upcoming activities, risks, and decisions needed</w:t>
+              <w:t>Design and data requirements for TBI Bank to build</w:t>
+            </w:r>
+          </w:p>
+        </w:tc>
+        <w:tc>
+          <w:tcPr>
+            <w:tcW w:type="dxa" w:w="2160"/>
+          </w:tcPr>
+          <w:p>
+            <w:r>
+              <w:rPr>
+                <w:sz w:val="20"/>
+              </w:rPr>
+              <w:t>Specification (DOCX)</w:t>
+            </w:r>
+          </w:p>
+        </w:tc>
+        <w:tc>
+          <w:tcPr>
+            <w:tcW w:type="dxa" w:w="2160"/>
+          </w:tcPr>
+          <w:p>
+            <w:r>
+              <w:rPr>
+                <w:sz w:val="20"/>
+              </w:rPr>
+              <w:t>Week 8</w:t>
+            </w:r>
+          </w:p>
+        </w:tc>
+      </w:tr>
+      <w:tr>
+        <w:tc>
+          <w:tcPr>
+            <w:tcW w:type="dxa" w:w="2160"/>
+          </w:tcPr>
+          <w:p>
+            <w:r>
+              <w:rPr>
+                <w:sz w:val="20"/>
+              </w:rPr>
+              <w:t>Team-Level Scorecards</w:t>
+            </w:r>
+          </w:p>
+        </w:tc>
+        <w:tc>
+          <w:tcPr>
+            <w:tcW w:type="dxa" w:w="2160"/>
+          </w:tcPr>
+          <w:p>
+            <w:r>
+              <w:rPr>
+                <w:sz w:val="20"/>
+              </w:rPr>
+              <w:t>Per-team adoption and maturity views</w:t>
+            </w:r>
+          </w:p>
+        </w:tc>
+        <w:tc>
+          <w:tcPr>
+            <w:tcW w:type="dxa" w:w="2160"/>
+          </w:tcPr>
+          <w:p>
+            <w:r>
+              <w:rPr>
+                <w:sz w:val="20"/>
+              </w:rPr>
+              <w:t>XLSX + PDF</w:t>
+            </w:r>
+          </w:p>
+        </w:tc>
+        <w:tc>
+          <w:tcPr>
+            <w:tcW w:type="dxa" w:w="2160"/>
+          </w:tcPr>
+          <w:p>
+            <w:r>
+              <w:rPr>
+                <w:sz w:val="20"/>
+              </w:rPr>
+              <w:t>Week 8</w:t>
+            </w:r>
+          </w:p>
+        </w:tc>
+      </w:tr>
+      <w:tr>
+        <w:tc>
+          <w:tcPr>
+            <w:tcW w:type="dxa" w:w="2160"/>
+          </w:tcPr>
+          <w:p>
+            <w:r>
+              <w:rPr>
+                <w:sz w:val="20"/>
+              </w:rPr>
+              <w:t>AI Acceleration Overlay</w:t>
+            </w:r>
+          </w:p>
+        </w:tc>
+        <w:tc>
+          <w:tcPr>
+            <w:tcW w:type="dxa" w:w="2160"/>
+          </w:tcPr>
+          <w:p>
+            <w:r>
+              <w:rPr>
+                <w:sz w:val="20"/>
+              </w:rPr>
+              <w:t>SDLC integration map for AI tooling</w:t>
+            </w:r>
+          </w:p>
+        </w:tc>
+        <w:tc>
+          <w:tcPr>
+            <w:tcW w:type="dxa" w:w="2160"/>
+          </w:tcPr>
+          <w:p>
+            <w:r>
+              <w:rPr>
+                <w:sz w:val="20"/>
+              </w:rPr>
+              <w:t>Report (DOCX/PDF)</w:t>
+            </w:r>
+          </w:p>
+        </w:tc>
+        <w:tc>
+          <w:tcPr>
+            <w:tcW w:type="dxa" w:w="2160"/>
+          </w:tcPr>
+          <w:p>
+            <w:r>
+              <w:rPr>
+                <w:sz w:val="20"/>
+              </w:rPr>
+              <w:t>Week 6</w:t>
+            </w:r>
+          </w:p>
+        </w:tc>
+      </w:tr>
+      <w:tr>
+        <w:tc>
+          <w:tcPr>
+            <w:tcW w:type="dxa" w:w="2160"/>
+          </w:tcPr>
+          <w:p>
+            <w:r>
+              <w:rPr>
+                <w:sz w:val="20"/>
+              </w:rPr>
+              <w:t>AI Quality Gates Specification</w:t>
+            </w:r>
+          </w:p>
+        </w:tc>
+        <w:tc>
+          <w:tcPr>
+            <w:tcW w:type="dxa" w:w="2160"/>
+          </w:tcPr>
+          <w:p>
+            <w:r>
+              <w:rPr>
+                <w:sz w:val="20"/>
+              </w:rPr>
+              <w:t>Standards for AI-generated code review and acceptance</w:t>
+            </w:r>
+          </w:p>
+        </w:tc>
+        <w:tc>
+          <w:tcPr>
+            <w:tcW w:type="dxa" w:w="2160"/>
+          </w:tcPr>
+          <w:p>
+            <w:r>
+              <w:rPr>
+                <w:sz w:val="20"/>
+              </w:rPr>
+              <w:t>Specification (DOCX)</w:t>
+            </w:r>
+          </w:p>
+        </w:tc>
+        <w:tc>
+          <w:tcPr>
+            <w:tcW w:type="dxa" w:w="2160"/>
+          </w:tcPr>
+          <w:p>
+            <w:r>
+              <w:rPr>
+                <w:sz w:val="20"/>
+              </w:rPr>
+              <w:t>Week 7</w:t>
+            </w:r>
+          </w:p>
+        </w:tc>
+      </w:tr>
+      <w:tr>
+        <w:tc>
+          <w:tcPr>
+            <w:tcW w:type="dxa" w:w="2160"/>
+          </w:tcPr>
+          <w:p>
+            <w:r>
+              <w:rPr>
+                <w:sz w:val="20"/>
+              </w:rPr>
+              <w:t>Vendor Performance Framework</w:t>
+            </w:r>
+          </w:p>
+        </w:tc>
+        <w:tc>
+          <w:tcPr>
+            <w:tcW w:type="dxa" w:w="2160"/>
+          </w:tcPr>
+          <w:p>
+            <w:r>
+              <w:rPr>
+                <w:sz w:val="20"/>
+              </w:rPr>
+              <w:t>KPIs, efficiency standards, and reporting expectations</w:t>
+            </w:r>
+          </w:p>
+        </w:tc>
+        <w:tc>
+          <w:tcPr>
+            <w:tcW w:type="dxa" w:w="2160"/>
+          </w:tcPr>
+          <w:p>
+            <w:r>
+              <w:rPr>
+                <w:sz w:val="20"/>
+              </w:rPr>
+              <w:t>Framework Doc (DOCX)</w:t>
+            </w:r>
+          </w:p>
+        </w:tc>
+        <w:tc>
+          <w:tcPr>
+            <w:tcW w:type="dxa" w:w="2160"/>
+          </w:tcPr>
+          <w:p>
+            <w:r>
+              <w:rPr>
+                <w:sz w:val="20"/>
+              </w:rPr>
+              <w:t>Week 10</w:t>
+            </w:r>
+          </w:p>
+        </w:tc>
+      </w:tr>
+      <w:tr>
+        <w:tc>
+          <w:tcPr>
+            <w:tcW w:type="dxa" w:w="2160"/>
+          </w:tcPr>
+          <w:p>
+            <w:r>
+              <w:rPr>
+                <w:sz w:val="20"/>
+              </w:rPr>
+              <w:t>Change Management Plan &amp; 90-Day Impact Assessment</w:t>
+            </w:r>
+          </w:p>
+        </w:tc>
+        <w:tc>
+          <w:tcPr>
+            <w:tcW w:type="dxa" w:w="2160"/>
+          </w:tcPr>
+          <w:p>
+            <w:r>
+              <w:rPr>
+                <w:sz w:val="20"/>
+              </w:rPr>
+              <w:t>Outcomes vs baseline and next-phase recommendations</w:t>
+            </w:r>
+          </w:p>
+        </w:tc>
+        <w:tc>
+          <w:tcPr>
+            <w:tcW w:type="dxa" w:w="2160"/>
+          </w:tcPr>
+          <w:p>
+            <w:r>
+              <w:rPr>
+                <w:sz w:val="20"/>
+              </w:rPr>
+              <w:t>Report + Presentation</w:t>
+            </w:r>
+          </w:p>
+        </w:tc>
+        <w:tc>
+          <w:tcPr>
+            <w:tcW w:type="dxa" w:w="2160"/>
+          </w:tcPr>
+          <w:p>
+            <w:r>
+              <w:rPr>
+                <w:sz w:val="20"/>
+              </w:rPr>
+              <w:t>Week 12</w:t>
+            </w:r>
+          </w:p>
+        </w:tc>
+      </w:tr>
+      <w:tr>
+        <w:tc>
+          <w:tcPr>
+            <w:tcW w:type="dxa" w:w="2160"/>
+          </w:tcPr>
+          <w:p>
+            <w:r>
+              <w:rPr>
+                <w:sz w:val="20"/>
+              </w:rPr>
+              <w:t>Weekly Progress Reports</w:t>
+            </w:r>
+          </w:p>
+        </w:tc>
+        <w:tc>
+          <w:tcPr>
+            <w:tcW w:type="dxa" w:w="2160"/>
+          </w:tcPr>
+          <w:p>
+            <w:r>
+              <w:rPr>
+                <w:sz w:val="20"/>
+              </w:rPr>
+              <w:t>Status updates covering completed work, upcoming activities, risks, and decisions needed</w:t>
             </w:r>
           </w:p>
         </w:tc>
@@ -1017,66 +1960,7 @@
           </w:p>
         </w:tc>
       </w:tr>
-      <w:tr>
-        <w:tc>
-          <w:tcPr>
-            <w:tcW w:type="dxa" w:w="2160"/>
-          </w:tcPr>
-          <w:p>
-            <w:r>
-              <w:rPr>
-                <w:sz w:val="20"/>
-              </w:rPr>
-              <w:t>Project Closeout Report</w:t>
-            </w:r>
-          </w:p>
-        </w:tc>
-        <w:tc>
-          <w:tcPr>
-            <w:tcW w:type="dxa" w:w="2160"/>
-          </w:tcPr>
-          <w:p>
-            <w:r>
-              <w:rPr>
-                <w:sz w:val="20"/>
-              </w:rPr>
-              <w:t>Final summary of work completed, outcomes achieved, recommendations for next steps, and transition plan</w:t>
-            </w:r>
-          </w:p>
-        </w:tc>
-        <w:tc>
-          <w:tcPr>
-            <w:tcW w:type="dxa" w:w="2160"/>
-          </w:tcPr>
-          <w:p>
-            <w:r>
-              <w:rPr>
-                <w:sz w:val="20"/>
-              </w:rPr>
-              <w:t>PPTX</w:t>
-            </w:r>
-          </w:p>
-        </w:tc>
-        <w:tc>
-          <w:tcPr>
-            <w:tcW w:type="dxa" w:w="2160"/>
-          </w:tcPr>
-          <w:p>
-            <w:r>
-              <w:rPr>
-                <w:sz w:val="20"/>
-              </w:rPr>
-              <w:t>Final Week</w:t>
-            </w:r>
-          </w:p>
-        </w:tc>
-      </w:tr>
     </w:tbl>
-    <w:p>
-      <w:r>
-        <w:br w:type="page"/>
-      </w:r>
-    </w:p>
     <w:p>
       <w:pPr>
         <w:pStyle w:val="Heading1"/>
@@ -1093,7 +1977,7 @@
         <w:rPr>
           <w:sz w:val="20"/>
         </w:rPr>
-        <w:t>The engagement will follow a phased approach:</w:t>
+        <w:t>The engagement follows a phased approach over 12 weeks:</w:t>
       </w:r>
     </w:p>
     <w:tbl>
@@ -1168,7 +2052,7 @@
               <w:rPr>
                 <w:sz w:val="20"/>
               </w:rPr>
-              <w:t>Discovery</w:t>
+              <w:t>Foundation (Weeks 1-3)</w:t>
             </w:r>
           </w:p>
         </w:tc>
@@ -1181,7 +2065,7 @@
               <w:rPr>
                 <w:sz w:val="20"/>
               </w:rPr>
-              <w:t>Stakeholder interviews, AI Masters Survey review, initiative prioritization, environment setup</w:t>
+              <w:t>Data landscape audit, KPI framework design, baseline measurement, initial workflow assessment</w:t>
             </w:r>
           </w:p>
         </w:tc>
@@ -1194,7 +2078,7 @@
               <w:rPr>
                 <w:sz w:val="20"/>
               </w:rPr>
-              <w:t>2 weeks</w:t>
+              <w:t>3 weeks</w:t>
             </w:r>
           </w:p>
         </w:tc>
@@ -1209,7 +2093,7 @@
               <w:rPr>
                 <w:sz w:val="20"/>
               </w:rPr>
-              <w:t>Build</w:t>
+              <w:t>Build &amp; Enable (Weeks 4-8)</w:t>
             </w:r>
           </w:p>
         </w:tc>
@@ -1222,7 +2106,7 @@
               <w:rPr>
                 <w:sz w:val="20"/>
               </w:rPr>
-              <w:t>Hands-on AI engineering for priority use cases, architecture design, pair programming, iterative development</w:t>
+              <w:t>Dashboard specification, team scorecards, AI acceleration overlay, quality gates, vendor framework development</w:t>
             </w:r>
           </w:p>
         </w:tc>
@@ -1235,7 +2119,7 @@
               <w:rPr>
                 <w:sz w:val="20"/>
               </w:rPr>
-              <w:t>4-6 weeks</w:t>
+              <w:t>5 weeks</w:t>
             </w:r>
           </w:p>
         </w:tc>
@@ -1250,7 +2134,7 @@
               <w:rPr>
                 <w:sz w:val="20"/>
               </w:rPr>
-              <w:t>Deliver</w:t>
+              <w:t>Measure &amp; Report (Weeks 9-12)</w:t>
             </w:r>
           </w:p>
         </w:tc>
@@ -1263,7 +2147,7 @@
               <w:rPr>
                 <w:sz w:val="20"/>
               </w:rPr>
-              <w:t>Code review, testing support, playbook creation, knowledge transfer sessions</w:t>
+              <w:t>Impact measurement, vendor framework delivery, 90-day impact assessment, next-phase recommendations</w:t>
             </w:r>
           </w:p>
         </w:tc>
@@ -1276,53 +2160,20 @@
               <w:rPr>
                 <w:sz w:val="20"/>
               </w:rPr>
-              <w:t>2 weeks</w:t>
-            </w:r>
-          </w:p>
-        </w:tc>
-      </w:tr>
-      <w:tr>
-        <w:tc>
-          <w:tcPr>
-            <w:tcW w:type="dxa" w:w="2880"/>
-          </w:tcPr>
-          <w:p>
-            <w:r>
-              <w:rPr>
-                <w:sz w:val="20"/>
-              </w:rPr>
-              <w:t>Close</w:t>
-            </w:r>
-          </w:p>
-        </w:tc>
-        <w:tc>
-          <w:tcPr>
-            <w:tcW w:type="dxa" w:w="2880"/>
-          </w:tcPr>
-          <w:p>
-            <w:r>
-              <w:rPr>
-                <w:sz w:val="20"/>
-              </w:rPr>
-              <w:t>Final deliverable review, closeout presentation, transition plan, sign-off</w:t>
-            </w:r>
-          </w:p>
-        </w:tc>
-        <w:tc>
-          <w:tcPr>
-            <w:tcW w:type="dxa" w:w="2880"/>
-          </w:tcPr>
-          <w:p>
-            <w:r>
-              <w:rPr>
-                <w:sz w:val="20"/>
-              </w:rPr>
-              <w:t>1 week</w:t>
+              <w:t>4 weeks</w:t>
             </w:r>
           </w:p>
         </w:tc>
       </w:tr>
     </w:tbl>
+    <w:p>
+      <w:r>
+        <w:rPr>
+          <w:sz w:val="20"/>
+        </w:rPr>
+        <w:t>Key Milestone: Week 6 Interim Report -- early adoption patterns, initial baseline data, and course corrections. Actionable data well before engagement end.</w:t>
+      </w:r>
+    </w:p>
     <w:p>
       <w:pPr>
         <w:pStyle w:val="Heading1"/>
@@ -1423,7 +2274,7 @@
               <w:rPr>
                 <w:sz w:val="20"/>
               </w:rPr>
-              <w:t>Managing Partner</w:t>
+              <w:t>Principal / Advisory Lead</w:t>
             </w:r>
           </w:p>
         </w:tc>
@@ -1449,7 +2300,7 @@
               <w:rPr>
                 <w:sz w:val="20"/>
               </w:rPr>
-              <w:t>Executive oversight, strategic advisory, client relationship management</w:t>
+              <w:t>Executive alignment, PE reporting, strategy</w:t>
             </w:r>
           </w:p>
         </w:tc>
@@ -1477,7 +2328,61 @@
               <w:rPr>
                 <w:sz w:val="20"/>
               </w:rPr>
-              <w:t>Lead Consultant</w:t>
+              <w:t>CTO / Technical Lead</w:t>
+            </w:r>
+          </w:p>
+        </w:tc>
+        <w:tc>
+          <w:tcPr>
+            <w:tcW w:type="dxa" w:w="2160"/>
+          </w:tcPr>
+          <w:p>
+            <w:r>
+              <w:rPr>
+                <w:sz w:val="20"/>
+              </w:rPr>
+              <w:t>Russell Beggs</w:t>
+            </w:r>
+          </w:p>
+        </w:tc>
+        <w:tc>
+          <w:tcPr>
+            <w:tcW w:type="dxa" w:w="2160"/>
+          </w:tcPr>
+          <w:p>
+            <w:r>
+              <w:rPr>
+                <w:sz w:val="20"/>
+              </w:rPr>
+              <w:t>Measurement design, workflow, vendor frameworks</w:t>
+            </w:r>
+          </w:p>
+        </w:tc>
+        <w:tc>
+          <w:tcPr>
+            <w:tcW w:type="dxa" w:w="2160"/>
+          </w:tcPr>
+          <w:p>
+            <w:r>
+              <w:rPr>
+                <w:sz w:val="20"/>
+              </w:rPr>
+              <w:t>Yelin.io</w:t>
+            </w:r>
+          </w:p>
+        </w:tc>
+      </w:tr>
+      <w:tr>
+        <w:tc>
+          <w:tcPr>
+            <w:tcW w:type="dxa" w:w="2160"/>
+          </w:tcPr>
+          <w:p>
+            <w:r>
+              <w:rPr>
+                <w:sz w:val="20"/>
+              </w:rPr>
+              <w:t>Programme Manager</w:t>
             </w:r>
           </w:p>
         </w:tc>
@@ -1503,7 +2408,7 @@
               <w:rPr>
                 <w:sz w:val="20"/>
               </w:rPr>
-              <w:t>Day-to-day delivery, AI engineering, architecture, knowledge transfer, project management</w:t>
+              <w:t>Stakeholder coordination, delivery cadence, project management</w:t>
             </w:r>
           </w:p>
         </w:tc>
@@ -1544,7 +2449,7 @@
               <w:rPr>
                 <w:sz w:val="20"/>
               </w:rPr>
-              <w:t>[TBD]</w:t>
+              <w:t>Gurkan Papila (SVP Technology)</w:t>
             </w:r>
           </w:p>
         </w:tc>
@@ -1557,7 +2462,7 @@
               <w:rPr>
                 <w:sz w:val="20"/>
               </w:rPr>
-              <w:t>Strategic oversight, budget authority, escalation path</w:t>
+              <w:t>Strategic oversight, budget authority, escalation path, fortnightly checkpoints</w:t>
             </w:r>
           </w:p>
         </w:tc>
@@ -1585,7 +2490,7 @@
               <w:rPr>
                 <w:sz w:val="20"/>
               </w:rPr>
-              <w:t>Technical Lead / POC</w:t>
+              <w:t>Working Group Lead</w:t>
             </w:r>
           </w:p>
         </w:tc>
@@ -1598,7 +2503,7 @@
               <w:rPr>
                 <w:sz w:val="20"/>
               </w:rPr>
-              <w:t>[TBD]</w:t>
+              <w:t>Nikola Kalfov</w:t>
             </w:r>
           </w:p>
         </w:tc>
@@ -1611,7 +2516,7 @@
               <w:rPr>
                 <w:sz w:val="20"/>
               </w:rPr>
-              <w:t>Day-to-day coordination, technical requirements, environment access, approvals</w:t>
+              <w:t>Day-to-day coordination, data access, technical requirements</w:t>
             </w:r>
           </w:p>
         </w:tc>
@@ -1639,7 +2544,7 @@
               <w:rPr>
                 <w:sz w:val="20"/>
               </w:rPr>
-              <w:t>AI/ML Engineers</w:t>
+              <w:t>Working Group Members</w:t>
             </w:r>
           </w:p>
         </w:tc>
@@ -1652,7 +2557,7 @@
               <w:rPr>
                 <w:sz w:val="20"/>
               </w:rPr>
-              <w:t>[TBD]</w:t>
+              <w:t>Oleksandr Kyslashko, Pavlina Bazhlekova, Sinan Turkmen</w:t>
             </w:r>
           </w:p>
         </w:tc>
@@ -1665,7 +2570,61 @@
               <w:rPr>
                 <w:sz w:val="20"/>
               </w:rPr>
-              <w:t>Pair programming participants, knowledge transfer recipients, UAT execution</w:t>
+              <w:t>Domain expertise (Mobile, Ops Automation, Data Engineering), weekly sessions</w:t>
+            </w:r>
+          </w:p>
+        </w:tc>
+        <w:tc>
+          <w:tcPr>
+            <w:tcW w:type="dxa" w:w="2160"/>
+          </w:tcPr>
+          <w:p>
+            <w:r>
+              <w:rPr>
+                <w:sz w:val="20"/>
+              </w:rPr>
+              <w:t>TBI Bank</w:t>
+            </w:r>
+          </w:p>
+        </w:tc>
+      </w:tr>
+      <w:tr>
+        <w:tc>
+          <w:tcPr>
+            <w:tcW w:type="dxa" w:w="2160"/>
+          </w:tcPr>
+          <w:p>
+            <w:r>
+              <w:rPr>
+                <w:sz w:val="20"/>
+              </w:rPr>
+              <w:t>Commercial Contact</w:t>
+            </w:r>
+          </w:p>
+        </w:tc>
+        <w:tc>
+          <w:tcPr>
+            <w:tcW w:type="dxa" w:w="2160"/>
+          </w:tcPr>
+          <w:p>
+            <w:r>
+              <w:rPr>
+                <w:sz w:val="20"/>
+              </w:rPr>
+              <w:t>Katerina [TBD]</w:t>
+            </w:r>
+          </w:p>
+        </w:tc>
+        <w:tc>
+          <w:tcPr>
+            <w:tcW w:type="dxa" w:w="2160"/>
+          </w:tcPr>
+          <w:p>
+            <w:r>
+              <w:rPr>
+                <w:sz w:val="20"/>
+              </w:rPr>
+              <w:t>Contract finalization and commercial agreement</w:t>
             </w:r>
           </w:p>
         </w:tc>
@@ -1700,7 +2659,7 @@
         <w:rPr>
           <w:sz w:val="20"/>
         </w:rPr>
-        <w:t>The project timeline is approximately 8-10 weeks:</w:t>
+        <w:t>The project timeline is 90 days (12 weeks):</w:t>
       </w:r>
     </w:p>
     <w:p>
@@ -1711,7 +2670,7 @@
         <w:rPr>
           <w:sz w:val="20"/>
         </w:rPr>
-        <w:t>Discovery Phase: 2 weeks -- [TBD start date]</w:t>
+        <w:t>Foundation Phase: Weeks 1-3 -- Target start: week of 23 March 2026</w:t>
       </w:r>
     </w:p>
     <w:p>
@@ -1722,7 +2681,7 @@
         <w:rPr>
           <w:sz w:val="20"/>
         </w:rPr>
-        <w:t>Build Phase: 4-6 weeks</w:t>
+        <w:t>Build &amp; Enable Phase: Weeks 4-8</w:t>
       </w:r>
     </w:p>
     <w:p>
@@ -1733,18 +2692,7 @@
         <w:rPr>
           <w:sz w:val="20"/>
         </w:rPr>
-        <w:t>Deliver Phase: 2 weeks</w:t>
-      </w:r>
-    </w:p>
-    <w:p>
-      <w:pPr>
-        <w:pStyle w:val="ListBullet"/>
-      </w:pPr>
-      <w:r>
-        <w:rPr>
-          <w:sz w:val="20"/>
-        </w:rPr>
-        <w:t>Close Phase: 1 week</w:t>
+        <w:t>Measure &amp; Report Phase: Weeks 9-12</w:t>
       </w:r>
     </w:p>
     <w:p>
@@ -1763,7 +2711,7 @@
         <w:rPr>
           <w:sz w:val="20"/>
         </w:rPr>
-        <w:t>Kick-off Meeting -- Week 1</w:t>
+        <w:t>Engagement Kick-off -- Week 1</w:t>
       </w:r>
     </w:p>
     <w:p>
@@ -1774,7 +2722,7 @@
         <w:rPr>
           <w:sz w:val="20"/>
         </w:rPr>
-        <w:t>AI Initiative Prioritization Approved -- End of Week 2</w:t>
+        <w:t>Baseline Measurement Complete -- Week 4</w:t>
       </w:r>
     </w:p>
     <w:p>
@@ -1785,7 +2733,7 @@
         <w:rPr>
           <w:sz w:val="20"/>
         </w:rPr>
-        <w:t>Architecture Review Gate -- Week 4</w:t>
+        <w:t>Week 6 Interim Report (checkpoint) -- Week 6</w:t>
       </w:r>
     </w:p>
     <w:p>
@@ -1796,7 +2744,7 @@
         <w:rPr>
           <w:sz w:val="20"/>
         </w:rPr>
-        <w:t>Playbook Draft Review -- Week 7</w:t>
+        <w:t>Dashboard Specification &amp; Scorecards Delivered -- Week 8</w:t>
       </w:r>
     </w:p>
     <w:p>
@@ -1807,7 +2755,59 @@
         <w:rPr>
           <w:sz w:val="20"/>
         </w:rPr>
-        <w:t>Project Closeout -- Final Week</w:t>
+        <w:t>Vendor Framework Delivered -- Week 10</w:t>
+      </w:r>
+    </w:p>
+    <w:p>
+      <w:pPr>
+        <w:pStyle w:val="ListBullet"/>
+      </w:pPr>
+      <w:r>
+        <w:rPr>
+          <w:sz w:val="20"/>
+        </w:rPr>
+        <w:t>90-Day Impact Assessment &amp; Closeout -- Week 12</w:t>
+      </w:r>
+    </w:p>
+    <w:p>
+      <w:r>
+        <w:rPr>
+          <w:sz w:val="20"/>
+        </w:rPr>
+        <w:t>Pre-Engagement Path:</w:t>
+      </w:r>
+    </w:p>
+    <w:p>
+      <w:pPr>
+        <w:pStyle w:val="ListBullet"/>
+      </w:pPr>
+      <w:r>
+        <w:rPr>
+          <w:sz w:val="20"/>
+        </w:rPr>
+        <w:t>Proposal review and feedback -- by 12 March 2026</w:t>
+      </w:r>
+    </w:p>
+    <w:p>
+      <w:pPr>
+        <w:pStyle w:val="ListBullet"/>
+      </w:pPr>
+      <w:r>
+        <w:rPr>
+          <w:sz w:val="20"/>
+        </w:rPr>
+        <w:t>Scope alignment and commercial agreement with Katerina -- w/c 16 March 2026</w:t>
+      </w:r>
+    </w:p>
+    <w:p>
+      <w:pPr>
+        <w:pStyle w:val="ListBullet"/>
+      </w:pPr>
+      <w:r>
+        <w:rPr>
+          <w:sz w:val="20"/>
+        </w:rPr>
+        <w:t>Data provision (Jira, Copilot telemetry, PR data) and kick-off -- w/c 23 March 2026</w:t>
       </w:r>
     </w:p>
     <w:p>
@@ -1821,12 +2821,449 @@
         <w:t>10. Pricing &amp; Payment</w:t>
       </w:r>
     </w:p>
+    <w:tbl>
+      <w:tblPr>
+        <w:tblStyle w:val="TableGrid"/>
+        <w:tblW w:type="auto" w:w="0"/>
+        <w:jc w:val="center"/>
+        <w:tblLook w:firstColumn="1" w:firstRow="1" w:lastColumn="0" w:lastRow="0" w:noHBand="0" w:noVBand="1" w:val="04A0"/>
+      </w:tblPr>
+      <w:tblGrid>
+        <w:gridCol w:w="2880"/>
+        <w:gridCol w:w="2880"/>
+        <w:gridCol w:w="2880"/>
+      </w:tblGrid>
+      <w:tr>
+        <w:tc>
+          <w:tcPr>
+            <w:tcW w:type="dxa" w:w="2880"/>
+            <w:shd w:val="clear" w:color="auto" w:fill="1B3A5C"/>
+          </w:tcPr>
+          <w:p>
+            <w:r>
+              <w:rPr>
+                <w:b/>
+                <w:color w:val="FFFFFF"/>
+                <w:sz w:val="20"/>
+              </w:rPr>
+              <w:t>Item</w:t>
+            </w:r>
+          </w:p>
+        </w:tc>
+        <w:tc>
+          <w:tcPr>
+            <w:tcW w:type="dxa" w:w="2880"/>
+            <w:shd w:val="clear" w:color="auto" w:fill="1B3A5C"/>
+          </w:tcPr>
+          <w:p>
+            <w:r>
+              <w:rPr>
+                <w:b/>
+                <w:color w:val="FFFFFF"/>
+                <w:sz w:val="20"/>
+              </w:rPr>
+              <w:t>Description</w:t>
+            </w:r>
+          </w:p>
+        </w:tc>
+        <w:tc>
+          <w:tcPr>
+            <w:tcW w:type="dxa" w:w="2880"/>
+            <w:shd w:val="clear" w:color="auto" w:fill="1B3A5C"/>
+          </w:tcPr>
+          <w:p>
+            <w:r>
+              <w:rPr>
+                <w:b/>
+                <w:color w:val="FFFFFF"/>
+                <w:sz w:val="20"/>
+              </w:rPr>
+              <w:t>Amount</w:t>
+            </w:r>
+          </w:p>
+        </w:tc>
+      </w:tr>
+      <w:tr>
+        <w:tc>
+          <w:tcPr>
+            <w:tcW w:type="dxa" w:w="2880"/>
+          </w:tcPr>
+          <w:p>
+            <w:r>
+              <w:rPr>
+                <w:sz w:val="20"/>
+              </w:rPr>
+              <w:t>Engagement Fee</w:t>
+            </w:r>
+          </w:p>
+        </w:tc>
+        <w:tc>
+          <w:tcPr>
+            <w:tcW w:type="dxa" w:w="2880"/>
+          </w:tcPr>
+          <w:p>
+            <w:r>
+              <w:rPr>
+                <w:sz w:val="20"/>
+              </w:rPr>
+              <w:t>Fixed-fee, 90-day AI Engineering Efficiency Program (2 workstreams, 9 deliverables + weekly reports)</w:t>
+            </w:r>
+          </w:p>
+        </w:tc>
+        <w:tc>
+          <w:tcPr>
+            <w:tcW w:type="dxa" w:w="2880"/>
+          </w:tcPr>
+          <w:p>
+            <w:r>
+              <w:rPr>
+                <w:sz w:val="20"/>
+              </w:rPr>
+              <w:t>€175,000</w:t>
+            </w:r>
+          </w:p>
+        </w:tc>
+      </w:tr>
+      <w:tr>
+        <w:tc>
+          <w:tcPr>
+            <w:tcW w:type="dxa" w:w="2880"/>
+          </w:tcPr>
+          <w:p>
+            <w:r>
+              <w:rPr>
+                <w:sz w:val="20"/>
+              </w:rPr>
+              <w:t>Expenses</w:t>
+            </w:r>
+          </w:p>
+        </w:tc>
+        <w:tc>
+          <w:tcPr>
+            <w:tcW w:type="dxa" w:w="2880"/>
+          </w:tcPr>
+          <w:p>
+            <w:r>
+              <w:rPr>
+                <w:sz w:val="20"/>
+              </w:rPr>
+              <w:t>Remote delivery included. On-site visits available as strategic option (billed separately if requested)</w:t>
+            </w:r>
+          </w:p>
+        </w:tc>
+        <w:tc>
+          <w:tcPr>
+            <w:tcW w:type="dxa" w:w="2880"/>
+          </w:tcPr>
+          <w:p>
+            <w:r>
+              <w:rPr>
+                <w:sz w:val="20"/>
+              </w:rPr>
+              <w:t>N/A</w:t>
+            </w:r>
+          </w:p>
+        </w:tc>
+      </w:tr>
+      <w:tr>
+        <w:tc>
+          <w:tcPr>
+            <w:tcW w:type="dxa" w:w="2880"/>
+          </w:tcPr>
+          <w:p>
+            <w:r>
+              <w:rPr>
+                <w:sz w:val="20"/>
+              </w:rPr>
+              <w:t>Total</w:t>
+            </w:r>
+          </w:p>
+        </w:tc>
+        <w:tc>
+          <w:tcPr>
+            <w:tcW w:type="dxa" w:w="2880"/>
+          </w:tcPr>
+          <w:p>
+            <w:r>
+              <w:rPr>
+                <w:sz w:val="20"/>
+              </w:rPr>
+            </w:r>
+          </w:p>
+        </w:tc>
+        <w:tc>
+          <w:tcPr>
+            <w:tcW w:type="dxa" w:w="2880"/>
+          </w:tcPr>
+          <w:p>
+            <w:r>
+              <w:rPr>
+                <w:sz w:val="20"/>
+              </w:rPr>
+              <w:t>€175,000</w:t>
+            </w:r>
+          </w:p>
+        </w:tc>
+      </w:tr>
+    </w:tbl>
+    <w:p/>
     <w:p>
       <w:r>
         <w:rPr>
           <w:sz w:val="20"/>
         </w:rPr>
-        <w:t>[TBD -- Pricing to be confirmed upon engagement approval]</w:t>
+        <w:t>Payment Schedule (Milestone-Based):</w:t>
+      </w:r>
+    </w:p>
+    <w:tbl>
+      <w:tblPr>
+        <w:tblStyle w:val="TableGrid"/>
+        <w:tblW w:type="auto" w:w="0"/>
+        <w:jc w:val="center"/>
+        <w:tblLook w:firstColumn="1" w:firstRow="1" w:lastColumn="0" w:lastRow="0" w:noHBand="0" w:noVBand="1" w:val="04A0"/>
+      </w:tblPr>
+      <w:tblGrid>
+        <w:gridCol w:w="2160"/>
+        <w:gridCol w:w="2160"/>
+        <w:gridCol w:w="2160"/>
+        <w:gridCol w:w="2160"/>
+      </w:tblGrid>
+      <w:tr>
+        <w:tc>
+          <w:tcPr>
+            <w:tcW w:type="dxa" w:w="2160"/>
+            <w:shd w:val="clear" w:color="auto" w:fill="1B3A5C"/>
+          </w:tcPr>
+          <w:p>
+            <w:r>
+              <w:rPr>
+                <w:b/>
+                <w:color w:val="FFFFFF"/>
+                <w:sz w:val="20"/>
+              </w:rPr>
+              <w:t>Milestone</w:t>
+            </w:r>
+          </w:p>
+        </w:tc>
+        <w:tc>
+          <w:tcPr>
+            <w:tcW w:type="dxa" w:w="2160"/>
+            <w:shd w:val="clear" w:color="auto" w:fill="1B3A5C"/>
+          </w:tcPr>
+          <w:p>
+            <w:r>
+              <w:rPr>
+                <w:b/>
+                <w:color w:val="FFFFFF"/>
+                <w:sz w:val="20"/>
+              </w:rPr>
+              <w:t>Timing</w:t>
+            </w:r>
+          </w:p>
+        </w:tc>
+        <w:tc>
+          <w:tcPr>
+            <w:tcW w:type="dxa" w:w="2160"/>
+            <w:shd w:val="clear" w:color="auto" w:fill="1B3A5C"/>
+          </w:tcPr>
+          <w:p>
+            <w:r>
+              <w:rPr>
+                <w:b/>
+                <w:color w:val="FFFFFF"/>
+                <w:sz w:val="20"/>
+              </w:rPr>
+              <w:t>Percentage</w:t>
+            </w:r>
+          </w:p>
+        </w:tc>
+        <w:tc>
+          <w:tcPr>
+            <w:tcW w:type="dxa" w:w="2160"/>
+            <w:shd w:val="clear" w:color="auto" w:fill="1B3A5C"/>
+          </w:tcPr>
+          <w:p>
+            <w:r>
+              <w:rPr>
+                <w:b/>
+                <w:color w:val="FFFFFF"/>
+                <w:sz w:val="20"/>
+              </w:rPr>
+              <w:t>Amount</w:t>
+            </w:r>
+          </w:p>
+        </w:tc>
+      </w:tr>
+      <w:tr>
+        <w:tc>
+          <w:tcPr>
+            <w:tcW w:type="dxa" w:w="2160"/>
+          </w:tcPr>
+          <w:p>
+            <w:r>
+              <w:rPr>
+                <w:sz w:val="20"/>
+              </w:rPr>
+              <w:t>Kick-off</w:t>
+            </w:r>
+          </w:p>
+        </w:tc>
+        <w:tc>
+          <w:tcPr>
+            <w:tcW w:type="dxa" w:w="2160"/>
+          </w:tcPr>
+          <w:p>
+            <w:r>
+              <w:rPr>
+                <w:sz w:val="20"/>
+              </w:rPr>
+              <w:t>Week 0</w:t>
+            </w:r>
+          </w:p>
+        </w:tc>
+        <w:tc>
+          <w:tcPr>
+            <w:tcW w:type="dxa" w:w="2160"/>
+          </w:tcPr>
+          <w:p>
+            <w:r>
+              <w:rPr>
+                <w:sz w:val="20"/>
+              </w:rPr>
+              <w:t>30%</w:t>
+            </w:r>
+          </w:p>
+        </w:tc>
+        <w:tc>
+          <w:tcPr>
+            <w:tcW w:type="dxa" w:w="2160"/>
+          </w:tcPr>
+          <w:p>
+            <w:r>
+              <w:rPr>
+                <w:sz w:val="20"/>
+              </w:rPr>
+              <w:t>€52,500</w:t>
+            </w:r>
+          </w:p>
+        </w:tc>
+      </w:tr>
+      <w:tr>
+        <w:tc>
+          <w:tcPr>
+            <w:tcW w:type="dxa" w:w="2160"/>
+          </w:tcPr>
+          <w:p>
+            <w:r>
+              <w:rPr>
+                <w:sz w:val="20"/>
+              </w:rPr>
+              <w:t>Mid-point (Week 6 Interim Report)</w:t>
+            </w:r>
+          </w:p>
+        </w:tc>
+        <w:tc>
+          <w:tcPr>
+            <w:tcW w:type="dxa" w:w="2160"/>
+          </w:tcPr>
+          <w:p>
+            <w:r>
+              <w:rPr>
+                <w:sz w:val="20"/>
+              </w:rPr>
+              <w:t>Week 6</w:t>
+            </w:r>
+          </w:p>
+        </w:tc>
+        <w:tc>
+          <w:tcPr>
+            <w:tcW w:type="dxa" w:w="2160"/>
+          </w:tcPr>
+          <w:p>
+            <w:r>
+              <w:rPr>
+                <w:sz w:val="20"/>
+              </w:rPr>
+              <w:t>40%</w:t>
+            </w:r>
+          </w:p>
+        </w:tc>
+        <w:tc>
+          <w:tcPr>
+            <w:tcW w:type="dxa" w:w="2160"/>
+          </w:tcPr>
+          <w:p>
+            <w:r>
+              <w:rPr>
+                <w:sz w:val="20"/>
+              </w:rPr>
+              <w:t>€70,000</w:t>
+            </w:r>
+          </w:p>
+        </w:tc>
+      </w:tr>
+      <w:tr>
+        <w:tc>
+          <w:tcPr>
+            <w:tcW w:type="dxa" w:w="2160"/>
+          </w:tcPr>
+          <w:p>
+            <w:r>
+              <w:rPr>
+                <w:sz w:val="20"/>
+              </w:rPr>
+              <w:t>Completion (90-Day Impact Assessment)</w:t>
+            </w:r>
+          </w:p>
+        </w:tc>
+        <w:tc>
+          <w:tcPr>
+            <w:tcW w:type="dxa" w:w="2160"/>
+          </w:tcPr>
+          <w:p>
+            <w:r>
+              <w:rPr>
+                <w:sz w:val="20"/>
+              </w:rPr>
+              <w:t>Week 12</w:t>
+            </w:r>
+          </w:p>
+        </w:tc>
+        <w:tc>
+          <w:tcPr>
+            <w:tcW w:type="dxa" w:w="2160"/>
+          </w:tcPr>
+          <w:p>
+            <w:r>
+              <w:rPr>
+                <w:sz w:val="20"/>
+              </w:rPr>
+              <w:t>30%</w:t>
+            </w:r>
+          </w:p>
+        </w:tc>
+        <w:tc>
+          <w:tcPr>
+            <w:tcW w:type="dxa" w:w="2160"/>
+          </w:tcPr>
+          <w:p>
+            <w:r>
+              <w:rPr>
+                <w:sz w:val="20"/>
+              </w:rPr>
+              <w:t>€52,500</w:t>
+            </w:r>
+          </w:p>
+        </w:tc>
+      </w:tr>
+    </w:tbl>
+    <w:p/>
+    <w:p>
+      <w:r>
+        <w:rPr>
+          <w:sz w:val="20"/>
+        </w:rPr>
+        <w:t>Terms: Net 30 from invoice date. Invoices issued at each milestone.</w:t>
       </w:r>
     </w:p>
     <w:p>
@@ -1834,7 +3271,7 @@
         <w:rPr>
           <w:sz w:val="20"/>
         </w:rPr>
-        <w:t>Payment Schedule:</w:t>
+        <w:t>ROI Context:</w:t>
       </w:r>
     </w:p>
     <w:p>
@@ -1845,15 +3282,29 @@
         <w:rPr>
           <w:sz w:val="20"/>
         </w:rPr>
-        <w:t>[TBD -- To be structured as milestone-based or monthly invoicing]</w:t>
+        <w:t>Projected Q1 ROI: 1.5x-2.5x based on 3-5% efficiency improvement</w:t>
       </w:r>
     </w:p>
     <w:p>
+      <w:pPr>
+        <w:pStyle w:val="ListBullet"/>
+      </w:pPr>
       <w:r>
         <w:rPr>
           <w:sz w:val="20"/>
         </w:rPr>
-        <w:t>Terms: Net 30 from invoice date.</w:t>
+        <w:t>Against approximately €9M in-house developer cost base</w:t>
+      </w:r>
+    </w:p>
+    <w:p>
+      <w:pPr>
+        <w:pStyle w:val="ListBullet"/>
+      </w:pPr>
+      <w:r>
+        <w:rPr>
+          <w:sz w:val="20"/>
+        </w:rPr>
+        <w:t>Result: €261K-€435K in capacity redirected (in-house; outsourced gains additional)</w:t>
       </w:r>
     </w:p>
     <w:p>
@@ -2004,7 +3455,7 @@
         <w:rPr>
           <w:sz w:val="20"/>
         </w:rPr>
-        <w:t>1. Yelin.io will notify the client's project lead of a potential change request.</w:t>
+        <w:t>1. Yelin.io will notify TBI Bank's project lead of a potential change request.</w:t>
       </w:r>
     </w:p>
     <w:p>
@@ -2015,7 +3466,7 @@
         <w:rPr>
           <w:sz w:val="20"/>
         </w:rPr>
-        <w:t>2. Yelin.io will meet with the client to discuss the requirements and impact.</w:t>
+        <w:t>2. Yelin.io will meet with TBI Bank to discuss the requirements and impact.</w:t>
       </w:r>
     </w:p>
     <w:p>
@@ -2037,7 +3488,7 @@
         <w:rPr>
           <w:sz w:val="20"/>
         </w:rPr>
-        <w:t>4. Yelin.io will obtain sign-off from the client's project sponsor before any additional work begins.</w:t>
+        <w:t>4. Yelin.io will obtain sign-off from TBI Bank's executive sponsor before any additional work begins.</w:t>
       </w:r>
     </w:p>
     <w:p/>

</xml_diff>